<commit_message>
Update Información para página web.docx
</commit_message>
<xml_diff>
--- a/Información para página web.docx
+++ b/Información para página web.docx
@@ -614,6 +614,15 @@
           <w:szCs w:val="21"/>
         </w:rPr>
         <w:t xml:space="preserve"> construcción de perfil profesional</w:t>
+      </w:r>
+      <w:r>
+        <w:rPr>
+          <w:rFonts w:ascii="Roboto" w:hAnsi="Roboto"/>
+          <w:color w:val="1F1F1F"/>
+          <w:sz w:val="21"/>
+          <w:szCs w:val="21"/>
+        </w:rPr>
+        <w:t>, organización, entre otros</w:t>
       </w:r>
     </w:p>
     <w:p>

</xml_diff>